<commit_message>
docs: seasonality decay-test is data-gated; record AV free-tier daily limit
The "disappearing post-2011" seasonality test needs deep daily history, but all
local caches are the same 5yr SIP window (2021-2026) and AlphaVantage free tier
dropped outputsize=full (now premium; free = last 100 bars). On the available
window the overlays are weak + OOS-negative (TOM OOS -0.74, pre-FOMC OOS -0.99,
insignificant) — consistent with decay but one regime can't adjudicate. Marked
the candidate data-gated, recorded the AV limit + Stooq/Tiingo alternative, and
updated the earnings-cache breadth note (63 train + 19 holdout).

Co-Authored-By: Claude Opus 4.8 <noreply@anthropic.com>
</commit_message>
<xml_diff>
--- a/docs/RESEARCH_CANDIDATES.docx
+++ b/docs/RESEARCH_CANDIDATES.docx
@@ -1245,19 +1245,19 @@
         <w:rPr>
           <w:b w:val="0"/>
         </w:rPr>
-        <w:t xml:space="preserve">   *Why it might survive:* our prior failures all died to </w:t>
+        <w:t xml:space="preserve">   ⚠️ </w:t>
       </w:r>
       <w:r>
         <w:rPr>
           <w:b/>
         </w:rPr>
-        <w:t>overtrading costs</w:t>
+        <w:t>The decisive test is DATA-GATED (2026-06).</w:t>
       </w:r>
       <w:r>
         <w:rPr>
           <w:b w:val="0"/>
         </w:rPr>
-        <w:t xml:space="preserve"> — these die</w:t>
+        <w:t xml:space="preserve"> The "disappearing post-2011" claim needs</w:t>
       </w:r>
     </w:p>
     <w:p>
@@ -1265,7 +1265,13 @@
         <w:rPr>
           <w:b w:val="0"/>
         </w:rPr>
-        <w:t xml:space="preserve">   the opposite way (~20 trades/yr total), so cost is a non-issue. Honest framing: a</w:t>
+        <w:t xml:space="preserve">   deep daily history, but </w:t>
+      </w:r>
+      <w:r>
+        <w:rPr>
+          <w:b/>
+        </w:rPr>
+        <w:t>every daily cache we have is the same 5yr SIP window (2021-06→2026-06)</w:t>
       </w:r>
     </w:p>
     <w:p>
@@ -1273,19 +1279,19 @@
         <w:rPr>
           <w:b w:val="0"/>
         </w:rPr>
-        <w:t xml:space="preserve">   </w:t>
+        <w:t xml:space="preserve">   and </w:t>
       </w:r>
       <w:r>
         <w:rPr>
           <w:b/>
         </w:rPr>
-        <w:t>risk-reduced beta overlay</w:t>
+        <w:t>AlphaVantage free tier no longer serves `outputsize=full`</w:t>
       </w:r>
       <w:r>
         <w:rPr>
           <w:b w:val="0"/>
         </w:rPr>
-        <w:t xml:space="preserve"> (cash-parked most days), cheap and fast to falsify; test the</w:t>
+        <w:t xml:space="preserve"> (now a premium feature; free =</w:t>
       </w:r>
     </w:p>
     <w:p>
@@ -1293,7 +1299,81 @@
         <w:rPr>
           <w:b w:val="0"/>
         </w:rPr>
-        <w:t xml:space="preserve">   "disappearing post-2011" claim head-on (pre-2011 IS vs post-2011 OOS).</w:t>
+        <w:t xml:space="preserve">   last 100 bars only). On the available 2021-2026 window the overlays are </w:t>
+      </w:r>
+      <w:r>
+        <w:rPr>
+          <w:b/>
+        </w:rPr>
+        <w:t>weak and OOS-negative</w:t>
+      </w:r>
+    </w:p>
+    <w:p>
+      <w:r>
+        <w:rPr>
+          <w:b w:val="0"/>
+        </w:rPr>
+        <w:t xml:space="preserve">   (SPY turn-of-month IS 0.73 / </w:t>
+      </w:r>
+      <w:r>
+        <w:rPr>
+          <w:b/>
+        </w:rPr>
+        <w:t>OOS −0.74</w:t>
+      </w:r>
+      <w:r>
+        <w:rPr>
+          <w:b w:val="0"/>
+        </w:rPr>
+        <w:t xml:space="preserve">, exposure 34%; pre-FOMC IS 0.61 / </w:t>
+      </w:r>
+      <w:r>
+        <w:rPr>
+          <w:b/>
+        </w:rPr>
+        <w:t>OOS −0.99</w:t>
+      </w:r>
+      <w:r>
+        <w:rPr>
+          <w:b w:val="0"/>
+        </w:rPr>
+        <w:t>;</w:t>
+      </w:r>
+    </w:p>
+    <w:p>
+      <w:r>
+        <w:rPr>
+          <w:b w:val="0"/>
+        </w:rPr>
+        <w:t xml:space="preserve">   QQQ similar; all t-stats insignificant, p 0.2–0.66) — consistent with the decay thesis, but one</w:t>
+      </w:r>
+    </w:p>
+    <w:p>
+      <w:r>
+        <w:rPr>
+          <w:b w:val="0"/>
+        </w:rPr>
+        <w:t xml:space="preserve">   regime can't adjudicate it. </w:t>
+      </w:r>
+      <w:r>
+        <w:rPr>
+          <w:b/>
+        </w:rPr>
+        <w:t>Status: marginal overlay, not a third leg.</w:t>
+      </w:r>
+      <w:r>
+        <w:rPr>
+          <w:b w:val="0"/>
+        </w:rPr>
+        <w:t xml:space="preserve"> To actually test the</w:t>
+      </w:r>
+    </w:p>
+    <w:p>
+      <w:r>
+        <w:rPr>
+          <w:b w:val="0"/>
+        </w:rPr>
+        <w:t xml:space="preserve">   decay split, source deep daily history (Stooq/Tiingo free, or a paid AV/Polygon tier).</w:t>
       </w:r>
     </w:p>
     <w:p>
@@ -1572,6 +1652,120 @@
           <w:b w:val="0"/>
         </w:rPr>
         <w:t>: free term-structure proxy for VIX-curve signals.</w:t>
+      </w:r>
+    </w:p>
+    <w:p>
+      <w:pPr>
+        <w:pStyle w:val="ListBullet"/>
+      </w:pPr>
+      <w:r>
+        <w:rPr>
+          <w:b/>
+        </w:rPr>
+        <w:t>AlphaVantage `TIME_SERIES_DAILY` (2026-06):</w:t>
+      </w:r>
+      <w:r>
+        <w:rPr>
+          <w:b w:val="0"/>
+        </w:rPr>
+        <w:t xml:space="preserve"> `outputsize=full` is now a </w:t>
+      </w:r>
+      <w:r>
+        <w:rPr>
+          <w:b/>
+        </w:rPr>
+        <w:t>PREMIUM</w:t>
+      </w:r>
+      <w:r>
+        <w:rPr>
+          <w:b w:val="0"/>
+        </w:rPr>
+        <w:t xml:space="preserve"> feature —</w:t>
+      </w:r>
+    </w:p>
+    <w:p>
+      <w:r>
+        <w:rPr>
+          <w:b w:val="0"/>
+        </w:rPr>
+        <w:t xml:space="preserve">  the free tier returns only the last ~100 bars (compact). This blocks any deep-history (pre-2011)</w:t>
+      </w:r>
+    </w:p>
+    <w:p>
+      <w:r>
+        <w:rPr>
+          <w:b w:val="0"/>
+        </w:rPr>
+        <w:t xml:space="preserve">  daily backtest on the free key. All local daily caches are the 5yr SIP window (2021-06→2026-06).</w:t>
+      </w:r>
+    </w:p>
+    <w:p>
+      <w:r>
+        <w:rPr>
+          <w:b w:val="0"/>
+        </w:rPr>
+        <w:t xml:space="preserve">  For deep daily history use </w:t>
+      </w:r>
+      <w:r>
+        <w:rPr>
+          <w:b/>
+        </w:rPr>
+        <w:t>Stooq</w:t>
+      </w:r>
+      <w:r>
+        <w:rPr>
+          <w:b w:val="0"/>
+        </w:rPr>
+        <w:t xml:space="preserve"> or </w:t>
+      </w:r>
+      <w:r>
+        <w:rPr>
+          <w:b/>
+        </w:rPr>
+        <w:t>Tiingo</w:t>
+      </w:r>
+      <w:r>
+        <w:rPr>
+          <w:b w:val="0"/>
+        </w:rPr>
+        <w:t xml:space="preserve"> (free, deep) instead.</w:t>
+      </w:r>
+    </w:p>
+    <w:p>
+      <w:pPr>
+        <w:pStyle w:val="ListBullet"/>
+      </w:pPr>
+      <w:r>
+        <w:rPr>
+          <w:b/>
+        </w:rPr>
+        <w:t>AlphaVantage earnings cache</w:t>
+      </w:r>
+      <w:r>
+        <w:rPr>
+          <w:b w:val="0"/>
+        </w:rPr>
+        <w:t xml:space="preserve"> now at </w:t>
+      </w:r>
+      <w:r>
+        <w:rPr>
+          <w:b/>
+        </w:rPr>
+        <w:t>63 train + 19 holdout symbols</w:t>
+      </w:r>
+      <w:r>
+        <w:rPr>
+          <w:b w:val="0"/>
+        </w:rPr>
+        <w:t xml:space="preserve"> (~30yr each); the daily</w:t>
+      </w:r>
+    </w:p>
+    <w:p>
+      <w:r>
+        <w:rPr>
+          <w:b w:val="0"/>
+        </w:rPr>
+        <w:t xml:space="preserve">  launchd job (18:15) trickles ~23/day under the ~25/day free cap. Full 195-universe still filling.</w:t>
       </w:r>
     </w:p>
     <w:sectPr>

</xml_diff>